<commit_message>
Updated cover document for validation
</commit_message>
<xml_diff>
--- a/S158_122/1.0.0/S-158_122_MPA_Validation_Checks_20251226.docx
+++ b/S158_122/1.0.0/S-158_122_MPA_Validation_Checks_20251226.docx
@@ -886,8 +886,8 @@
             <w:r>
               <w:fldChar w:fldCharType="separate"/>
             </w:r>
-            <w:bookmarkStart w:id="49" w:name="LIBTypeTitre"/>
-            <w:bookmarkStart w:id="50" w:name="LIBTypeTitreCEN"/>
+            <w:bookmarkStart w:id="49" w:name="LIBTypeTitreCEN"/>
+            <w:bookmarkStart w:id="50" w:name="LIBTypeTitre"/>
             <w:bookmarkEnd w:id="49"/>
             <w:bookmarkEnd w:id="50"/>
             <w:r>
@@ -922,9 +922,9 @@
             <w:r>
               <w:fldChar w:fldCharType="separate"/>
             </w:r>
-            <w:bookmarkStart w:id="52" w:name="LibEnteteCEN"/>
+            <w:bookmarkStart w:id="52" w:name="LibEntete"/>
             <w:bookmarkStart w:id="53" w:name="LibFileEnTete"/>
-            <w:bookmarkStart w:id="54" w:name="LibEntete"/>
+            <w:bookmarkStart w:id="54" w:name="LibEnteteCEN"/>
             <w:bookmarkEnd w:id="52"/>
             <w:bookmarkEnd w:id="53"/>
             <w:bookmarkEnd w:id="54"/>
@@ -960,8 +960,8 @@
             <w:r>
               <w:fldChar w:fldCharType="separate"/>
             </w:r>
-            <w:bookmarkStart w:id="56" w:name="LIBASynchroVF"/>
-            <w:bookmarkStart w:id="57" w:name="LIBASynchro"/>
+            <w:bookmarkStart w:id="56" w:name="LIBASynchro"/>
+            <w:bookmarkStart w:id="57" w:name="LIBASynchroVF"/>
             <w:bookmarkEnd w:id="56"/>
             <w:bookmarkEnd w:id="57"/>
             <w:r>
@@ -1668,7 +1668,7 @@
                                   <w:szCs w:val="28"/>
                                   <w:lang w:val="en-GB"/>
                                 </w:rPr>
-                                <w:t>2</w:t>
+                                <w:t>1</w:t>
                               </w:r>
                               <w:r>
                                 <w:rPr>
@@ -2225,7 +2225,7 @@
                             <w:szCs w:val="28"/>
                             <w:lang w:val="en-GB"/>
                           </w:rPr>
-                          <w:t>2</w:t>
+                          <w:t>1</w:t>
                         </w:r>
                         <w:r>
                           <w:rPr>
@@ -11705,13 +11705,13 @@
         <w:t>_1_</w:t>
       </w:r>
       <w:r>
-        <w:t>1</w:t>
+        <w:t>0</w:t>
       </w:r>
       <w:r>
         <w:t>_0_YYYYMMDD. The build date is the YYYYMMDD suffix in the file name, whereas the “1_</w:t>
       </w:r>
       <w:r>
-        <w:t>1</w:t>
+        <w:t>0</w:t>
       </w:r>
       <w:r>
         <w:t>_0” component represents the edition, revision, and clarification number. The file with the same edition and revision number as this document but with the most recent</w:t>

</xml_diff>

<commit_message>
Update cover document for validation
Correct edition number on cover page
</commit_message>
<xml_diff>
--- a/S158_122/1.0.0/S-158_122_MPA_Validation_Checks_20251226.docx
+++ b/S158_122/1.0.0/S-158_122_MPA_Validation_Checks_20251226.docx
@@ -1668,7 +1668,7 @@
                                   <w:szCs w:val="28"/>
                                   <w:lang w:val="en-GB"/>
                                 </w:rPr>
-                                <w:t>2</w:t>
+                                <w:t>1</w:t>
                               </w:r>
                               <w:r>
                                 <w:rPr>
@@ -2225,7 +2225,7 @@
                             <w:szCs w:val="28"/>
                             <w:lang w:val="en-GB"/>
                           </w:rPr>
-                          <w:t>2</w:t>
+                          <w:t>1</w:t>
                         </w:r>
                         <w:r>
                           <w:rPr>
@@ -11705,13 +11705,19 @@
         <w:t>_1_</w:t>
       </w:r>
       <w:r>
-        <w:t>1</w:t>
-      </w:r>
-      <w:r>
-        <w:t>_0_YYYYMMDD. The build date is the YYYYMMDD suffix in the file name, whereas the “1_</w:t>
-      </w:r>
-      <w:r>
-        <w:t>1</w:t>
+        <w:t>0</w:t>
+      </w:r>
+      <w:r>
+        <w:t>_</w:t>
+      </w:r>
+      <w:r>
+        <w:t>0</w:t>
+      </w:r>
+      <w:r>
+        <w:t>_YYYYMMDD. The build date is the YYYYMMDD suffix in the file name, whereas the “1_</w:t>
+      </w:r>
+      <w:r>
+        <w:t>0</w:t>
       </w:r>
       <w:r>
         <w:t>_0” component represents the edition, revision, and clarification number. The file with the same edition and revision number as this document but with the most recent</w:t>

</xml_diff>